<commit_message>
feat: v1.8.8 离线中文安装包、WebView2 自修复与 Blockly AI 增强
修复 zh-CN MSI 误用旧产物导致安装版落后于运行版的问题；Setup 自带离线 WebView2 与冲突修复；增强 Blockly 加载可靠性与操控页 UI。

Co-authored-by: Cursor <cursoragent@cursor.com>
</commit_message>
<xml_diff>
--- a/docs/copyright/源程序-前30页.docx
+++ b/docs/copyright/源程序-前30页.docx
@@ -12,7 +12,7 @@
           <w:b w:val="0"/>
           <w:sz w:val="16"/>
         </w:rPr>
-        <w:t>领鹏智能机器人上位机软件 V1.7.9 - 源程序(前30页)</w:t>
+        <w:t>领鹏智能机器人上位机软件 V1.8.7 - 源程序(前30页)</w:t>
       </w:r>
     </w:p>
     <w:p>
@@ -38,7 +38,7 @@
           <w:b w:val="0"/>
           <w:sz w:val="16"/>
         </w:rPr>
-        <w:t>版本号：V1.7.9</w:t>
+        <w:t>版本号：V1.8.7</w:t>
       </w:r>
     </w:p>
     <w:p>
@@ -64,7 +64,7 @@
           <w:b w:val="0"/>
           <w:sz w:val="16"/>
         </w:rPr>
-        <w:t>生成日期：2026-06-25</w:t>
+        <w:t>生成日期：2026-07-13</w:t>
       </w:r>
     </w:p>
     <w:p>
@@ -20417,7 +20417,7 @@
         <w:b w:val="0"/>
         <w:sz w:val="18"/>
       </w:rPr>
-      <w:t>领鹏智能机器人上位机软件 V1.7.9 — 源程序</w:t>
+      <w:t>领鹏智能机器人上位机软件 V1.8.7 — 源程序</w:t>
     </w:r>
   </w:p>
 </w:hdr>

</xml_diff>